<commit_message>
Updated script.js to fix localStorage JSON issue
</commit_message>
<xml_diff>
--- a/Rapport atelier 2.docx
+++ b/Rapport atelier 2.docx
@@ -9,6 +9,7 @@
           <w:rFonts w:ascii="Tahoma" w:eastAsia="Times New Roman" w:hAnsi="Tahoma" w:cs="Tahoma"/>
           <w:sz w:val="24"/>
           <w:szCs w:val="24"/>
+          <w:lang w:val="fr-FR"/>
         </w:rPr>
       </w:pPr>
       <w:r>
@@ -276,6 +277,7 @@
           <w:rFonts w:ascii="Tahoma" w:eastAsia="Times New Roman" w:hAnsi="Tahoma" w:cs="Tahoma"/>
           <w:sz w:val="24"/>
           <w:szCs w:val="24"/>
+          <w:lang w:val="fr-FR"/>
         </w:rPr>
       </w:pPr>
     </w:p>
@@ -302,21 +304,7 @@
           <w:highlight w:val="yellow"/>
           <w:lang w:val="fr-FR"/>
         </w:rPr>
-        <w:t>Exercice 2 : Gestion des étudiant</w:t>
-      </w:r>
-      <w:bookmarkStart w:id="0" w:name="_GoBack"/>
-      <w:bookmarkEnd w:id="0"/>
-      <w:r>
-        <w:rPr>
-          <w:rFonts w:ascii="Tahoma" w:eastAsia="Times New Roman" w:hAnsi="Tahoma" w:cs="Tahoma"/>
-          <w:b/>
-          <w:bCs/>
-          <w:sz w:val="36"/>
-          <w:szCs w:val="36"/>
-          <w:highlight w:val="yellow"/>
-          <w:lang w:val="fr-FR"/>
-        </w:rPr>
-        <w:t>s et professeurs</w:t>
+        <w:t>Exercice 2 : Gestion des étudiants et professeurs</w:t>
       </w:r>
     </w:p>
     <w:p>
@@ -522,6 +510,7 @@
           <w:rFonts w:ascii="Tahoma" w:eastAsia="Times New Roman" w:hAnsi="Tahoma" w:cs="Tahoma"/>
           <w:sz w:val="24"/>
           <w:szCs w:val="24"/>
+          <w:lang w:val="fr-FR"/>
         </w:rPr>
       </w:pPr>
     </w:p>
@@ -819,6 +808,7 @@
           <w:rFonts w:ascii="Tahoma" w:eastAsia="Times New Roman" w:hAnsi="Tahoma" w:cs="Tahoma"/>
           <w:sz w:val="24"/>
           <w:szCs w:val="24"/>
+          <w:lang w:val="fr-FR"/>
         </w:rPr>
       </w:pPr>
     </w:p>
@@ -1115,13 +1105,13 @@
           <w:rFonts w:ascii="Tahoma" w:eastAsia="Times New Roman" w:hAnsi="Tahoma" w:cs="Tahoma"/>
           <w:sz w:val="24"/>
           <w:szCs w:val="24"/>
-        </w:rPr>
-      </w:pPr>
-    </w:p>
-    <w:p>
-      <w:pPr>
-        <w:spacing w:before="100" w:beforeAutospacing="1" w:after="100" w:afterAutospacing="1" w:line="240" w:lineRule="auto"/>
-        <w:outlineLvl w:val="1"/>
+          <w:lang w:val="fr-FR"/>
+        </w:rPr>
+      </w:pPr>
+    </w:p>
+    <w:p>
+      <w:pPr>
+        <w:spacing w:before="100" w:beforeAutospacing="1" w:after="100" w:afterAutospacing="1" w:line="240" w:lineRule="auto"/>
         <w:rPr>
           <w:rFonts w:ascii="Tahoma" w:eastAsia="Times New Roman" w:hAnsi="Tahoma" w:cs="Tahoma"/>
           <w:b/>
@@ -1140,27 +1130,31 @@
           <w:szCs w:val="36"/>
           <w:lang w:val="fr-FR"/>
         </w:rPr>
-        <w:t>Conclusion</w:t>
-      </w:r>
-    </w:p>
-    <w:p>
-      <w:pPr>
-        <w:spacing w:before="100" w:beforeAutospacing="1" w:after="100" w:afterAutospacing="1" w:line="240" w:lineRule="auto"/>
-        <w:rPr>
-          <w:rFonts w:ascii="Tahoma" w:eastAsia="Times New Roman" w:hAnsi="Tahoma" w:cs="Tahoma"/>
-          <w:sz w:val="24"/>
-          <w:szCs w:val="24"/>
-          <w:lang w:val="fr-FR"/>
-        </w:rPr>
-      </w:pPr>
-      <w:r>
-        <w:rPr>
-          <w:rFonts w:ascii="Tahoma" w:eastAsia="Times New Roman" w:hAnsi="Tahoma" w:cs="Tahoma"/>
-          <w:sz w:val="24"/>
-          <w:szCs w:val="24"/>
-          <w:lang w:val="fr-FR"/>
-        </w:rPr>
-        <w:t>Cet atelier m’a permis de mieux comprendre la POO en JavaScript. J’ai appris à structurer mon code avec des classes, à utiliser l'héritage et à manipuler des objets. L'exercice sur le mini blog a été particulièrement intéressant, car il rassemblait plusieurs notions en une seule application. Cette approche m'a aidé à voir comment la POO peut être utilisée pour organiser des projets plus complexes.</w:t>
+        <w:t>Lien </w:t>
+      </w:r>
+      <w:proofErr w:type="spellStart"/>
+      <w:r>
+        <w:rPr>
+          <w:rFonts w:ascii="Tahoma" w:eastAsia="Times New Roman" w:hAnsi="Tahoma" w:cs="Tahoma"/>
+          <w:b/>
+          <w:bCs/>
+          <w:sz w:val="36"/>
+          <w:szCs w:val="36"/>
+          <w:lang w:val="fr-FR"/>
+        </w:rPr>
+        <w:t>github</w:t>
+      </w:r>
+      <w:proofErr w:type="spellEnd"/>
+      <w:r>
+        <w:rPr>
+          <w:rFonts w:ascii="Tahoma" w:eastAsia="Times New Roman" w:hAnsi="Tahoma" w:cs="Tahoma"/>
+          <w:b/>
+          <w:bCs/>
+          <w:sz w:val="36"/>
+          <w:szCs w:val="36"/>
+          <w:lang w:val="fr-FR"/>
+        </w:rPr>
+        <w:t> :</w:t>
       </w:r>
     </w:p>
     <w:p>
@@ -1170,6 +1164,18 @@
           <w:lang w:val="fr-FR"/>
         </w:rPr>
       </w:pPr>
+      <w:r>
+        <w:rPr>
+          <w:rFonts w:ascii="Tahoma" w:eastAsia="Times New Roman" w:hAnsi="Tahoma" w:cs="Tahoma"/>
+          <w:color w:val="0070C0"/>
+          <w:sz w:val="24"/>
+          <w:szCs w:val="24"/>
+          <w:lang w:val="fr-FR"/>
+        </w:rPr>
+        <w:t>https://github.com/mohamedAmine-L10/atelier2/tree/atelier2</w:t>
+      </w:r>
+      <w:bookmarkStart w:id="0" w:name="_GoBack"/>
+      <w:bookmarkEnd w:id="0"/>
     </w:p>
     <w:sectPr>
       <w:pgSz w:w="12240" w:h="15840"/>
@@ -2544,7 +2550,7 @@
 </file>
 
 <file path=customXml/itemProps1.xml><?xml version="1.0" encoding="utf-8"?>
-<ds:datastoreItem xmlns:ds="http://schemas.openxmlformats.org/officeDocument/2006/customXml" ds:itemID="{F0995F96-BE72-4E78-8241-8786C7D35D21}">
+<ds:datastoreItem xmlns:ds="http://schemas.openxmlformats.org/officeDocument/2006/customXml" ds:itemID="{2259545B-361E-42CD-BF76-7A84709391DD}">
   <ds:schemaRefs>
     <ds:schemaRef ds:uri="http://schemas.openxmlformats.org/officeDocument/2006/bibliography"/>
   </ds:schemaRefs>

</xml_diff>